<commit_message>
Update Lecture Companion with ENOSPC error-code concept section (7.1)
</commit_message>
<xml_diff>
--- a/9. Companion reference === Lecture_Companion_RDMA_InfiniBand_Concepts.docx
+++ b/9. Companion reference === Lecture_Companion_RDMA_InfiniBand_Concepts.docx
@@ -2257,6 +2257,202 @@
                 <w:szCs w:val="22"/>
               </w:rPr>
               <w:t xml:space="preserve">Every single “Failed status Work Request Flushed Error (5) for wr_id 2” throughout the RDMA debugging was this exact pattern — the real failure was always wr_id 0 or 1 (the actual ibv_reg_mr call), and wr_id 2's flush was just the downstream consequence, reported by the tool as if it were the primary error.</w:t>
+            </w:r>
+          </w:p>
+        </w:tc>
+      </w:tr>
+    </w:tbl>
+    <w:p>
+      <w:pPr>
+        <w:pStyle w:val="Heading2"/>
+        <w:spacing w:after="140" w:before="280"/>
+      </w:pPr>
+      <w:r>
+        <w:rPr>
+          <w:b/>
+          <w:bCs/>
+          <w:color w:val="0E7C7B"/>
+          <w:sz w:val="24"/>
+          <w:szCs w:val="24"/>
+        </w:rPr>
+        <w:t xml:space="preserve">7.1 — ENOSPC: Why This Specific Error Code Is So Misleading</w:t>
+      </w:r>
+    </w:p>
+    <w:tbl>
+      <w:tblPr>
+        <w:tblW w:type="pct" w:w="100%"/>
+        <w:tblBorders>
+          <w:top w:val="single" w:color="1155CC" w:sz="4"/>
+          <w:left w:val="single" w:color="1155CC" w:sz="4"/>
+          <w:bottom w:val="single" w:color="1155CC" w:sz="4"/>
+          <w:right w:val="single" w:color="1155CC" w:sz="4"/>
+          <w:insideH w:val="single" w:color="auto" w:sz="4"/>
+          <w:insideV w:val="single" w:color="auto" w:sz="4"/>
+        </w:tblBorders>
+      </w:tblPr>
+      <w:tblGrid>
+        <w:gridCol w:w="100"/>
+      </w:tblGrid>
+      <w:tr>
+        <w:tc>
+          <w:tcPr>
+            <w:shd w:fill="E8F0FE" w:val="clear"/>
+            <w:tcMar>
+              <w:top w:type="dxa" w:w="150"/>
+              <w:left w:type="dxa" w:w="200"/>
+              <w:bottom w:type="dxa" w:w="150"/>
+              <w:right w:type="dxa" w:w="200"/>
+            </w:tcMar>
+          </w:tcPr>
+          <w:p>
+            <w:pPr>
+              <w:spacing w:after="80"/>
+            </w:pPr>
+            <w:r>
+              <w:rPr>
+                <w:b/>
+                <w:bCs/>
+                <w:color w:val="1155CC"/>
+                <w:sz w:val="22"/>
+                <w:szCs w:val="22"/>
+              </w:rPr>
+              <w:t xml:space="preserve">📖 CONCEPT</w:t>
+            </w:r>
+          </w:p>
+          <w:p>
+            <w:pPr>
+              <w:spacing w:after="100"/>
+            </w:pPr>
+            <w:r>
+              <w:rPr>
+                <w:sz w:val="22"/>
+                <w:szCs w:val="22"/>
+              </w:rPr>
+              <w:t xml:space="preserve">Linux system calls report failure through a small, fixed set of numbered error codes (“errno” values) — there are only a few hundred of them, shared across the entire kernel, every subsystem, every driver. ENOSPC was originally defined for exactly one situation: a filesystem write failing because the disk is full (“Error: NO SPaCe”).</w:t>
+            </w:r>
+          </w:p>
+          <w:p>
+            <w:pPr>
+              <w:spacing w:after="0"/>
+            </w:pPr>
+            <w:r>
+              <w:rPr>
+                <w:sz w:val="22"/>
+                <w:szCs w:val="22"/>
+              </w:rPr>
+              <w:t xml:space="preserve">The RDMA subsystem reuses that same errno for a completely unrelated situation: a kernel resource pool (queue pairs, memory regions, completion queues — finite tables the kernel allocates for RDMA objects) is exhausted or a specific allocation within it failed. There's no disk involved at all. This kind of errno reuse is common throughout Linux — the kernel doesn't invent a new error code for every possible failure reason, it maps new failures onto the closest existing meaning, even when that mapping reads as actively misleading to someone unfamiliar with the specific subsystem.</w:t>
+            </w:r>
+          </w:p>
+        </w:tc>
+      </w:tr>
+    </w:tbl>
+    <w:tbl>
+      <w:tblPr>
+        <w:tblW w:type="pct" w:w="100%"/>
+        <w:tblBorders>
+          <w:top w:val="single" w:color="B45309" w:sz="4"/>
+          <w:left w:val="single" w:color="B45309" w:sz="4"/>
+          <w:bottom w:val="single" w:color="B45309" w:sz="4"/>
+          <w:right w:val="single" w:color="B45309" w:sz="4"/>
+          <w:insideH w:val="single" w:color="auto" w:sz="4"/>
+          <w:insideV w:val="single" w:color="auto" w:sz="4"/>
+        </w:tblBorders>
+      </w:tblPr>
+      <w:tblGrid>
+        <w:gridCol w:w="100"/>
+      </w:tblGrid>
+      <w:tr>
+        <w:tc>
+          <w:tcPr>
+            <w:shd w:fill="FEF3E2" w:val="clear"/>
+            <w:tcMar>
+              <w:top w:type="dxa" w:w="150"/>
+              <w:left w:type="dxa" w:w="200"/>
+              <w:bottom w:type="dxa" w:w="150"/>
+              <w:right w:type="dxa" w:w="200"/>
+            </w:tcMar>
+          </w:tcPr>
+          <w:p>
+            <w:pPr>
+              <w:spacing w:after="80"/>
+            </w:pPr>
+            <w:r>
+              <w:rPr>
+                <w:b/>
+                <w:bCs/>
+                <w:color w:val="B45309"/>
+                <w:sz w:val="22"/>
+                <w:szCs w:val="22"/>
+              </w:rPr>
+              <w:t xml:space="preserve">⚡ QUICK RECALL</w:t>
+            </w:r>
+          </w:p>
+          <w:p>
+            <w:pPr>
+              <w:spacing w:after="0"/>
+            </w:pPr>
+            <w:r>
+              <w:rPr>
+                <w:sz w:val="22"/>
+                <w:szCs w:val="22"/>
+              </w:rPr>
+              <w:t xml:space="preserve">ENOSPC from an RDMA ioctl() almost never means “disk full.” It means a kernel-side RDMA resource allocation failed — the real cause has to be found by tracing which specific allocation failed (which verb, which object), not by looking for a full filesystem.</w:t>
+            </w:r>
+          </w:p>
+        </w:tc>
+      </w:tr>
+    </w:tbl>
+    <w:tbl>
+      <w:tblPr>
+        <w:tblW w:type="pct" w:w="100%"/>
+        <w:tblBorders>
+          <w:top w:val="single" w:color="2E7D32" w:sz="4"/>
+          <w:left w:val="single" w:color="2E7D32" w:sz="4"/>
+          <w:bottom w:val="single" w:color="2E7D32" w:sz="4"/>
+          <w:right w:val="single" w:color="2E7D32" w:sz="4"/>
+          <w:insideH w:val="single" w:color="auto" w:sz="4"/>
+          <w:insideV w:val="single" w:color="auto" w:sz="4"/>
+        </w:tblBorders>
+      </w:tblPr>
+      <w:tblGrid>
+        <w:gridCol w:w="100"/>
+      </w:tblGrid>
+      <w:tr>
+        <w:tc>
+          <w:tcPr>
+            <w:shd w:fill="E6F4EA" w:val="clear"/>
+            <w:tcMar>
+              <w:top w:type="dxa" w:w="150"/>
+              <w:left w:type="dxa" w:w="200"/>
+              <w:bottom w:type="dxa" w:w="150"/>
+              <w:right w:type="dxa" w:w="200"/>
+            </w:tcMar>
+          </w:tcPr>
+          <w:p>
+            <w:pPr>
+              <w:spacing w:after="80"/>
+            </w:pPr>
+            <w:r>
+              <w:rPr>
+                <w:b/>
+                <w:bCs/>
+                <w:color w:val="2E7D32"/>
+                <w:sz w:val="22"/>
+                <w:szCs w:val="22"/>
+              </w:rPr>
+              <w:t xml:space="preserve">🔍 WHERE YOU ACTUALLY SAW THIS</w:t>
+            </w:r>
+          </w:p>
+          <w:p>
+            <w:pPr>
+              <w:spacing w:after="0"/>
+            </w:pPr>
+            <w:r>
+              <w:rPr>
+                <w:sz w:val="22"/>
+                <w:szCs w:val="22"/>
+              </w:rPr>
+              <w:t xml:space="preserve">The exact error — "ioctl(RDMA_VERBS_IOCTL) = -1 ENOSPC (No space left on device)" — was traced via strace directly to a failing ibv_reg_mr call, with disk space never actually being the issue at any point. Five separate, individually plausible root causes were tested and disproven (RLIMIT_MEMLOCK, host-wide locked memory, IPv6 addressing mode, kernel module resource parameters, accumulated test-state exhaustion) before the investigation correctly concluded the failure was isolated to the client role specifically — still unresolved as a final root cause, but rigorously characterized. The complete investigation, including every disproven hypothesis and the exact evidence that ruled each one out, is documented in full in Workbook AI, Appendix B — not repeated here, since that's already the authoritative, detailed account.</w:t>
             </w:r>
           </w:p>
         </w:tc>

</xml_diff>

<commit_message>
Add lkey/rkey and DCQCN RP/CP/NP naming to Lecture Companion
</commit_message>
<xml_diff>
--- a/9. Companion reference === Lecture_Companion_RDMA_InfiniBand_Concepts.docx
+++ b/9. Companion reference === Lecture_Companion_RDMA_InfiniBand_Concepts.docx
@@ -977,6 +977,214 @@
     </w:tbl>
     <w:p>
       <w:pPr>
+        <w:pStyle w:val="Heading2"/>
+        <w:spacing w:after="140" w:before="280"/>
+      </w:pPr>
+      <w:r>
+        <w:rPr>
+          <w:b/>
+          <w:bCs/>
+          <w:color w:val="0E7C7B"/>
+          <w:sz w:val="24"/>
+          <w:szCs w:val="24"/>
+        </w:rPr>
+        <w:t xml:space="preserve">2.3 — What Memory Registration Actually Produces: lkey and rkey</w:t>
+      </w:r>
+    </w:p>
+    <w:tbl>
+      <w:tblPr>
+        <w:tblW w:type="pct" w:w="100%"/>
+        <w:tblBorders>
+          <w:top w:val="single" w:color="1155CC" w:sz="4"/>
+          <w:left w:val="single" w:color="1155CC" w:sz="4"/>
+          <w:bottom w:val="single" w:color="1155CC" w:sz="4"/>
+          <w:right w:val="single" w:color="1155CC" w:sz="4"/>
+          <w:insideH w:val="single" w:color="auto" w:sz="4"/>
+          <w:insideV w:val="single" w:color="auto" w:sz="4"/>
+        </w:tblBorders>
+      </w:tblPr>
+      <w:tblGrid>
+        <w:gridCol w:w="100"/>
+      </w:tblGrid>
+      <w:tr>
+        <w:tc>
+          <w:tcPr>
+            <w:shd w:fill="E8F0FE" w:val="clear"/>
+            <w:tcMar>
+              <w:top w:type="dxa" w:w="150"/>
+              <w:left w:type="dxa" w:w="200"/>
+              <w:bottom w:type="dxa" w:w="150"/>
+              <w:right w:type="dxa" w:w="200"/>
+            </w:tcMar>
+          </w:tcPr>
+          <w:p>
+            <w:pPr>
+              <w:spacing w:after="80"/>
+            </w:pPr>
+            <w:r>
+              <w:rPr>
+                <w:b/>
+                <w:bCs/>
+                <w:color w:val="1155CC"/>
+                <w:sz w:val="22"/>
+                <w:szCs w:val="22"/>
+              </w:rPr>
+              <w:t xml:space="preserve">📖 CONCEPT</w:t>
+            </w:r>
+          </w:p>
+          <w:p>
+            <w:pPr>
+              <w:spacing w:after="100"/>
+            </w:pPr>
+            <w:r>
+              <w:rPr>
+                <w:sz w:val="22"/>
+                <w:szCs w:val="22"/>
+              </w:rPr>
+              <w:t xml:space="preserve">ibv_reg_mr doesn't just “register a buffer” and return success — it returns two separate keys, and the distinction between them is the actual security/addressing mechanism that makes RDMA safe to expose to a remote machine at all.</w:t>
+            </w:r>
+          </w:p>
+          <w:p>
+            <w:pPr>
+              <w:spacing w:after="100"/>
+            </w:pPr>
+            <w:r>
+              <w:rPr>
+                <w:sz w:val="22"/>
+                <w:szCs w:val="22"/>
+              </w:rPr>
+              <w:t xml:space="preserve">lkey (Local Key): used when the SAME host that registered the memory posts its own work requests (send, recv, local read/write) against that buffer. Never leaves the local machine.</w:t>
+            </w:r>
+          </w:p>
+          <w:p>
+            <w:pPr>
+              <w:spacing w:after="0"/>
+            </w:pPr>
+            <w:r>
+              <w:rPr>
+                <w:sz w:val="22"/>
+                <w:szCs w:val="22"/>
+              </w:rPr>
+              <w:t xml:space="preserve">rkey (Remote Key): handed to the OTHER side of the connection, out of band, as part of setting up the exchange. When the remote peer wants to do an RDMA Read or RDMA Write directly into this memory region, it must present this exact rkey. The local NIC hardware checks it before allowing the access — without a matching rkey, a remote machine cannot touch this memory, no matter what address it asks for.</w:t>
+            </w:r>
+          </w:p>
+        </w:tc>
+      </w:tr>
+    </w:tbl>
+    <w:tbl>
+      <w:tblPr>
+        <w:tblW w:type="pct" w:w="100%"/>
+        <w:tblBorders>
+          <w:top w:val="single" w:color="B45309" w:sz="4"/>
+          <w:left w:val="single" w:color="B45309" w:sz="4"/>
+          <w:bottom w:val="single" w:color="B45309" w:sz="4"/>
+          <w:right w:val="single" w:color="B45309" w:sz="4"/>
+          <w:insideH w:val="single" w:color="auto" w:sz="4"/>
+          <w:insideV w:val="single" w:color="auto" w:sz="4"/>
+        </w:tblBorders>
+      </w:tblPr>
+      <w:tblGrid>
+        <w:gridCol w:w="100"/>
+      </w:tblGrid>
+      <w:tr>
+        <w:tc>
+          <w:tcPr>
+            <w:shd w:fill="FEF3E2" w:val="clear"/>
+            <w:tcMar>
+              <w:top w:type="dxa" w:w="150"/>
+              <w:left w:type="dxa" w:w="200"/>
+              <w:bottom w:type="dxa" w:w="150"/>
+              <w:right w:type="dxa" w:w="200"/>
+            </w:tcMar>
+          </w:tcPr>
+          <w:p>
+            <w:pPr>
+              <w:spacing w:after="80"/>
+            </w:pPr>
+            <w:r>
+              <w:rPr>
+                <w:b/>
+                <w:bCs/>
+                <w:color w:val="B45309"/>
+                <w:sz w:val="22"/>
+                <w:szCs w:val="22"/>
+              </w:rPr>
+              <w:t xml:space="preserve">⚡ QUICK RECALL</w:t>
+            </w:r>
+          </w:p>
+          <w:p>
+            <w:pPr>
+              <w:spacing w:after="0"/>
+            </w:pPr>
+            <w:r>
+              <w:rPr>
+                <w:sz w:val="22"/>
+                <w:szCs w:val="22"/>
+              </w:rPr>
+              <w:t xml:space="preserve">lkey = “my own hardware, touching my own registered memory.” rkey = “the permission slip I hand to someone else so their hardware can touch my memory directly.” Both come from the same ibv_reg_mr call — registration produces both keys at once, for the same region.</w:t>
+            </w:r>
+          </w:p>
+        </w:tc>
+      </w:tr>
+    </w:tbl>
+    <w:tbl>
+      <w:tblPr>
+        <w:tblW w:type="pct" w:w="100%"/>
+        <w:tblBorders>
+          <w:top w:val="single" w:color="2E7D32" w:sz="4"/>
+          <w:left w:val="single" w:color="2E7D32" w:sz="4"/>
+          <w:bottom w:val="single" w:color="2E7D32" w:sz="4"/>
+          <w:right w:val="single" w:color="2E7D32" w:sz="4"/>
+          <w:insideH w:val="single" w:color="auto" w:sz="4"/>
+          <w:insideV w:val="single" w:color="auto" w:sz="4"/>
+        </w:tblBorders>
+      </w:tblPr>
+      <w:tblGrid>
+        <w:gridCol w:w="100"/>
+      </w:tblGrid>
+      <w:tr>
+        <w:tc>
+          <w:tcPr>
+            <w:shd w:fill="E6F4EA" w:val="clear"/>
+            <w:tcMar>
+              <w:top w:type="dxa" w:w="150"/>
+              <w:left w:type="dxa" w:w="200"/>
+              <w:bottom w:type="dxa" w:w="150"/>
+              <w:right w:type="dxa" w:w="200"/>
+            </w:tcMar>
+          </w:tcPr>
+          <w:p>
+            <w:pPr>
+              <w:spacing w:after="80"/>
+            </w:pPr>
+            <w:r>
+              <w:rPr>
+                <w:b/>
+                <w:bCs/>
+                <w:color w:val="2E7D32"/>
+                <w:sz w:val="22"/>
+                <w:szCs w:val="22"/>
+              </w:rPr>
+              <w:t xml:space="preserve">🔍 WHERE YOU ACTUALLY SAW THIS</w:t>
+            </w:r>
+          </w:p>
+          <w:p>
+            <w:pPr>
+              <w:spacing w:after="0"/>
+            </w:pPr>
+            <w:r>
+              <w:rPr>
+                <w:sz w:val="22"/>
+                <w:szCs w:val="22"/>
+              </w:rPr>
+              <w:t xml:space="preserve">Every ibv_rc_pingpong exchange throughout this lab depended on this exact mechanism working correctly, even though the tool never printed either key directly — the QPN/PSN exchange over the bootstrap TCP connection (port 18515) is precisely the out-of-band step where rkeys (along with the QPN and PSN already discussed) get communicated to the other side before any real RDMA operation is attempted.</w:t>
+            </w:r>
+          </w:p>
+        </w:tc>
+      </w:tr>
+    </w:tbl>
+    <w:p>
+      <w:pPr>
         <w:pStyle w:val="Heading1"/>
         <w:spacing w:after="200" w:before="420"/>
       </w:pPr>
@@ -1921,6 +2129,434 @@
                 <w:szCs w:val="22"/>
               </w:rPr>
               <w:t xml:space="preserve">tcpdump -i eth1 -n udp port 4791 was the exact filter used throughout the ENOSPC investigation — real evidence that zero packets ever left the sender's interface, which is what conclusively ruled out the fabric/ACL theory and pointed the investigation back toward the sender's own memory registration step.</w:t>
+            </w:r>
+          </w:p>
+        </w:tc>
+      </w:tr>
+    </w:tbl>
+    <w:p>
+      <w:pPr>
+        <w:pStyle w:val="Heading2"/>
+        <w:spacing w:after="140" w:before="280"/>
+      </w:pPr>
+      <w:r>
+        <w:rPr>
+          <w:b/>
+          <w:bCs/>
+          <w:color w:val="0E7C7B"/>
+          <w:sz w:val="24"/>
+          <w:szCs w:val="24"/>
+        </w:rPr>
+        <w:t xml:space="preserve">5.1 — DCQCN's Three Named Roles: RP, CP, NP</w:t>
+      </w:r>
+    </w:p>
+    <w:tbl>
+      <w:tblPr>
+        <w:tblW w:type="pct" w:w="100%"/>
+        <w:tblBorders>
+          <w:top w:val="single" w:color="1155CC" w:sz="4"/>
+          <w:left w:val="single" w:color="1155CC" w:sz="4"/>
+          <w:bottom w:val="single" w:color="1155CC" w:sz="4"/>
+          <w:right w:val="single" w:color="1155CC" w:sz="4"/>
+          <w:insideH w:val="single" w:color="auto" w:sz="4"/>
+          <w:insideV w:val="single" w:color="auto" w:sz="4"/>
+        </w:tblBorders>
+      </w:tblPr>
+      <w:tblGrid>
+        <w:gridCol w:w="100"/>
+      </w:tblGrid>
+      <w:tr>
+        <w:tc>
+          <w:tcPr>
+            <w:shd w:fill="E8F0FE" w:val="clear"/>
+            <w:tcMar>
+              <w:top w:type="dxa" w:w="150"/>
+              <w:left w:type="dxa" w:w="200"/>
+              <w:bottom w:type="dxa" w:w="150"/>
+              <w:right w:type="dxa" w:w="200"/>
+            </w:tcMar>
+          </w:tcPr>
+          <w:p>
+            <w:pPr>
+              <w:spacing w:after="80"/>
+            </w:pPr>
+            <w:r>
+              <w:rPr>
+                <w:b/>
+                <w:bCs/>
+                <w:color w:val="1155CC"/>
+                <w:sz w:val="22"/>
+                <w:szCs w:val="22"/>
+              </w:rPr>
+              <w:t xml:space="preserve">📖 CONCEPT</w:t>
+            </w:r>
+          </w:p>
+          <w:p>
+            <w:pPr>
+              <w:spacing w:after="0"/>
+            </w:pPr>
+            <w:r>
+              <w:rPr>
+                <w:sz w:val="22"/>
+                <w:szCs w:val="22"/>
+              </w:rPr>
+              <w:t xml:space="preserve">Workbook AI's A3/A4 already covered the DCQCN mechanism itself (switch marks a packet, receiver reflects it back as a CNP, sender throttles) — but never gave the three participants their actual, standardized names. Worth knowing these cold; DCQCN = Data Center Quantized Congestion Notification, and the full name itself is worth being able to state precisely, not just the acronym.</w:t>
+            </w:r>
+          </w:p>
+        </w:tc>
+      </w:tr>
+    </w:tbl>
+    <w:tbl>
+      <w:tblPr>
+        <w:tblW w:type="dxa" w:w="9000"/>
+        <w:tblBorders>
+          <w:top w:val="single" w:color="auto" w:sz="4"/>
+          <w:left w:val="single" w:color="auto" w:sz="4"/>
+          <w:bottom w:val="single" w:color="auto" w:sz="4"/>
+          <w:right w:val="single" w:color="auto" w:sz="4"/>
+          <w:insideH w:val="single" w:color="auto" w:sz="4"/>
+          <w:insideV w:val="single" w:color="auto" w:sz="4"/>
+        </w:tblBorders>
+      </w:tblPr>
+      <w:tblGrid>
+        <w:gridCol w:w="2600"/>
+        <w:gridCol w:w="2200"/>
+        <w:gridCol w:w="4200"/>
+      </w:tblGrid>
+      <w:tr>
+        <w:trPr>
+          <w:cantSplit/>
+          <w:tblHeader/>
+        </w:trPr>
+        <w:tc>
+          <w:tcPr>
+            <w:tcW w:type="dxa" w:w="2600"/>
+            <w:shd w:fill="1F3864" w:val="clear"/>
+            <w:tcMar>
+              <w:top w:type="dxa" w:w="100"/>
+              <w:left w:type="dxa" w:w="120"/>
+              <w:bottom w:type="dxa" w:w="100"/>
+              <w:right w:type="dxa" w:w="120"/>
+            </w:tcMar>
+          </w:tcPr>
+          <w:p>
+            <w:r>
+              <w:rPr>
+                <w:b/>
+                <w:bCs/>
+                <w:color w:val="FFFFFF"/>
+                <w:sz w:val="20"/>
+                <w:szCs w:val="20"/>
+              </w:rPr>
+              <w:t xml:space="preserve">Role</w:t>
+            </w:r>
+          </w:p>
+        </w:tc>
+        <w:tc>
+          <w:tcPr>
+            <w:tcW w:type="dxa" w:w="2200"/>
+            <w:shd w:fill="1F3864" w:val="clear"/>
+            <w:tcMar>
+              <w:top w:type="dxa" w:w="100"/>
+              <w:left w:type="dxa" w:w="120"/>
+              <w:bottom w:type="dxa" w:w="100"/>
+              <w:right w:type="dxa" w:w="120"/>
+            </w:tcMar>
+          </w:tcPr>
+          <w:p>
+            <w:r>
+              <w:rPr>
+                <w:b/>
+                <w:bCs/>
+                <w:color w:val="FFFFFF"/>
+                <w:sz w:val="20"/>
+                <w:szCs w:val="20"/>
+              </w:rPr>
+              <w:t xml:space="preserve">Located at</w:t>
+            </w:r>
+          </w:p>
+        </w:tc>
+        <w:tc>
+          <w:tcPr>
+            <w:tcW w:type="dxa" w:w="4200"/>
+            <w:shd w:fill="1F3864" w:val="clear"/>
+            <w:tcMar>
+              <w:top w:type="dxa" w:w="100"/>
+              <w:left w:type="dxa" w:w="120"/>
+              <w:bottom w:type="dxa" w:w="100"/>
+              <w:right w:type="dxa" w:w="120"/>
+            </w:tcMar>
+          </w:tcPr>
+          <w:p>
+            <w:r>
+              <w:rPr>
+                <w:b/>
+                <w:bCs/>
+                <w:color w:val="FFFFFF"/>
+                <w:sz w:val="20"/>
+                <w:szCs w:val="20"/>
+              </w:rPr>
+              <w:t xml:space="preserve">Does what</w:t>
+            </w:r>
+          </w:p>
+        </w:tc>
+      </w:tr>
+      <w:tr>
+        <w:trPr>
+          <w:cantSplit/>
+        </w:trPr>
+        <w:tc>
+          <w:tcPr>
+            <w:tcW w:type="dxa" w:w="2600"/>
+            <w:shd w:fill="FFFFFF" w:val="clear"/>
+            <w:tcMar>
+              <w:top w:type="dxa" w:w="100"/>
+              <w:left w:type="dxa" w:w="120"/>
+              <w:bottom w:type="dxa" w:w="100"/>
+              <w:right w:type="dxa" w:w="120"/>
+            </w:tcMar>
+          </w:tcPr>
+          <w:p>
+            <w:r>
+              <w:rPr>
+                <w:sz w:val="20"/>
+                <w:szCs w:val="20"/>
+              </w:rPr>
+              <w:t xml:space="preserve">CP — Congestion Point</w:t>
+            </w:r>
+          </w:p>
+        </w:tc>
+        <w:tc>
+          <w:tcPr>
+            <w:tcW w:type="dxa" w:w="2200"/>
+            <w:shd w:fill="FFFFFF" w:val="clear"/>
+            <w:tcMar>
+              <w:top w:type="dxa" w:w="100"/>
+              <w:left w:type="dxa" w:w="120"/>
+              <w:bottom w:type="dxa" w:w="100"/>
+              <w:right w:type="dxa" w:w="120"/>
+            </w:tcMar>
+          </w:tcPr>
+          <w:p>
+            <w:r>
+              <w:rPr>
+                <w:sz w:val="20"/>
+                <w:szCs w:val="20"/>
+              </w:rPr>
+              <w:t xml:space="preserve">The switch, at egress</w:t>
+            </w:r>
+          </w:p>
+        </w:tc>
+        <w:tc>
+          <w:tcPr>
+            <w:tcW w:type="dxa" w:w="4200"/>
+            <w:shd w:fill="FFFFFF" w:val="clear"/>
+            <w:tcMar>
+              <w:top w:type="dxa" w:w="100"/>
+              <w:left w:type="dxa" w:w="120"/>
+              <w:bottom w:type="dxa" w:w="100"/>
+              <w:right w:type="dxa" w:w="120"/>
+            </w:tcMar>
+          </w:tcPr>
+          <w:p>
+            <w:r>
+              <w:rPr>
+                <w:sz w:val="20"/>
+                <w:szCs w:val="20"/>
+              </w:rPr>
+              <w:t xml:space="preserve">Monitors queue depth; marks packets with ECN when a threshold is crossed (the WRED mechanism from Workbook AI A3)</w:t>
+            </w:r>
+          </w:p>
+        </w:tc>
+      </w:tr>
+      <w:tr>
+        <w:trPr>
+          <w:cantSplit/>
+        </w:trPr>
+        <w:tc>
+          <w:tcPr>
+            <w:tcW w:type="dxa" w:w="2600"/>
+            <w:shd w:fill="F2F2F2" w:val="clear"/>
+            <w:tcMar>
+              <w:top w:type="dxa" w:w="100"/>
+              <w:left w:type="dxa" w:w="120"/>
+              <w:bottom w:type="dxa" w:w="100"/>
+              <w:right w:type="dxa" w:w="120"/>
+            </w:tcMar>
+          </w:tcPr>
+          <w:p>
+            <w:r>
+              <w:rPr>
+                <w:sz w:val="20"/>
+                <w:szCs w:val="20"/>
+              </w:rPr>
+              <w:t xml:space="preserve">NP — Notification Point</w:t>
+            </w:r>
+          </w:p>
+        </w:tc>
+        <w:tc>
+          <w:tcPr>
+            <w:tcW w:type="dxa" w:w="2200"/>
+            <w:shd w:fill="F2F2F2" w:val="clear"/>
+            <w:tcMar>
+              <w:top w:type="dxa" w:w="100"/>
+              <w:left w:type="dxa" w:w="120"/>
+              <w:bottom w:type="dxa" w:w="100"/>
+              <w:right w:type="dxa" w:w="120"/>
+            </w:tcMar>
+          </w:tcPr>
+          <w:p>
+            <w:r>
+              <w:rPr>
+                <w:sz w:val="20"/>
+                <w:szCs w:val="20"/>
+              </w:rPr>
+              <w:t xml:space="preserve">The receiver</w:t>
+            </w:r>
+          </w:p>
+        </w:tc>
+        <w:tc>
+          <w:tcPr>
+            <w:tcW w:type="dxa" w:w="4200"/>
+            <w:shd w:fill="F2F2F2" w:val="clear"/>
+            <w:tcMar>
+              <w:top w:type="dxa" w:w="100"/>
+              <w:left w:type="dxa" w:w="120"/>
+              <w:bottom w:type="dxa" w:w="100"/>
+              <w:right w:type="dxa" w:w="120"/>
+            </w:tcMar>
+          </w:tcPr>
+          <w:p>
+            <w:r>
+              <w:rPr>
+                <w:sz w:val="20"/>
+                <w:szCs w:val="20"/>
+              </w:rPr>
+              <w:t xml:space="preserve">Sees the ECN-marked (Congestion Experienced) packet; generates and sends a CNP back to the sender</w:t>
+            </w:r>
+          </w:p>
+        </w:tc>
+      </w:tr>
+      <w:tr>
+        <w:trPr>
+          <w:cantSplit/>
+        </w:trPr>
+        <w:tc>
+          <w:tcPr>
+            <w:tcW w:type="dxa" w:w="2600"/>
+            <w:shd w:fill="FFFFFF" w:val="clear"/>
+            <w:tcMar>
+              <w:top w:type="dxa" w:w="100"/>
+              <w:left w:type="dxa" w:w="120"/>
+              <w:bottom w:type="dxa" w:w="100"/>
+              <w:right w:type="dxa" w:w="120"/>
+            </w:tcMar>
+          </w:tcPr>
+          <w:p>
+            <w:r>
+              <w:rPr>
+                <w:sz w:val="20"/>
+                <w:szCs w:val="20"/>
+              </w:rPr>
+              <w:t xml:space="preserve">RP — Reaction Point</w:t>
+            </w:r>
+          </w:p>
+        </w:tc>
+        <w:tc>
+          <w:tcPr>
+            <w:tcW w:type="dxa" w:w="2200"/>
+            <w:shd w:fill="FFFFFF" w:val="clear"/>
+            <w:tcMar>
+              <w:top w:type="dxa" w:w="100"/>
+              <w:left w:type="dxa" w:w="120"/>
+              <w:bottom w:type="dxa" w:w="100"/>
+              <w:right w:type="dxa" w:w="120"/>
+            </w:tcMar>
+          </w:tcPr>
+          <w:p>
+            <w:r>
+              <w:rPr>
+                <w:sz w:val="20"/>
+                <w:szCs w:val="20"/>
+              </w:rPr>
+              <w:t xml:space="preserve">The sender</w:t>
+            </w:r>
+          </w:p>
+        </w:tc>
+        <w:tc>
+          <w:tcPr>
+            <w:tcW w:type="dxa" w:w="4200"/>
+            <w:shd w:fill="FFFFFF" w:val="clear"/>
+            <w:tcMar>
+              <w:top w:type="dxa" w:w="100"/>
+              <w:left w:type="dxa" w:w="120"/>
+              <w:bottom w:type="dxa" w:w="100"/>
+              <w:right w:type="dxa" w:w="120"/>
+            </w:tcMar>
+          </w:tcPr>
+          <w:p>
+            <w:r>
+              <w:rPr>
+                <w:sz w:val="20"/>
+                <w:szCs w:val="20"/>
+              </w:rPr>
+              <w:t xml:space="preserve">Receives the CNP; reduces its transmission rate, then gradually ramps back up if no further CNPs arrive</w:t>
+            </w:r>
+          </w:p>
+        </w:tc>
+      </w:tr>
+    </w:tbl>
+    <w:tbl>
+      <w:tblPr>
+        <w:tblW w:type="pct" w:w="100%"/>
+        <w:tblBorders>
+          <w:top w:val="single" w:color="B45309" w:sz="4"/>
+          <w:left w:val="single" w:color="B45309" w:sz="4"/>
+          <w:bottom w:val="single" w:color="B45309" w:sz="4"/>
+          <w:right w:val="single" w:color="B45309" w:sz="4"/>
+          <w:insideH w:val="single" w:color="auto" w:sz="4"/>
+          <w:insideV w:val="single" w:color="auto" w:sz="4"/>
+        </w:tblBorders>
+      </w:tblPr>
+      <w:tblGrid>
+        <w:gridCol w:w="100"/>
+      </w:tblGrid>
+      <w:tr>
+        <w:tc>
+          <w:tcPr>
+            <w:shd w:fill="FEF3E2" w:val="clear"/>
+            <w:tcMar>
+              <w:top w:type="dxa" w:w="150"/>
+              <w:left w:type="dxa" w:w="200"/>
+              <w:bottom w:type="dxa" w:w="150"/>
+              <w:right w:type="dxa" w:w="200"/>
+            </w:tcMar>
+          </w:tcPr>
+          <w:p>
+            <w:pPr>
+              <w:spacing w:after="80"/>
+            </w:pPr>
+            <w:r>
+              <w:rPr>
+                <w:b/>
+                <w:bCs/>
+                <w:color w:val="B45309"/>
+                <w:sz w:val="22"/>
+                <w:szCs w:val="22"/>
+              </w:rPr>
+              <w:t xml:space="preserve">⚡ QUICK RECALL</w:t>
+            </w:r>
+          </w:p>
+          <w:p>
+            <w:pPr>
+              <w:spacing w:after="0"/>
+            </w:pPr>
+            <w:r>
+              <w:rPr>
+                <w:sz w:val="22"/>
+                <w:szCs w:val="22"/>
+              </w:rPr>
+              <w:t xml:space="preserve">One packet flows forward through the CP (gets marked) to the NP (triggers a CNP back). One CNP flows backward to the RP (which actually changes its behavior). Three distinct locations, three distinct jobs — confirmed directly from Microsoft's own Azure RDMA engineering documentation, describing the exact same mechanism this lab's soft-RoCE testing rode on top of (even though DCQCN's real rate-reaction logic itself can't run in software — Workbook AI A4's honest scoping).</w:t>
             </w:r>
           </w:p>
         </w:tc>

</xml_diff>